<commit_message>
Sin tailwind en front
</commit_message>
<xml_diff>
--- a/frontend/Migracion-tailwind-a-css.docx
+++ b/frontend/Migracion-tailwind-a-css.docx
@@ -1930,43 +1930,103 @@
           <w:b/>
           <w:bCs/>
         </w:rPr>
-        <w:t xml:space="preserve">8. Estado y pasos que faltan</w:t>
-      </w:r>
-    </w:p>
-    <w:p>
-      <w:pPr>
-        <w:pStyle w:val="ListParagraph"/>
-        <w:numPr>
-          <w:ilvl w:val="0"/>
-          <w:numId w:val="2"/>
-        </w:numPr>
-        <w:spacing w:after="60"/>
-      </w:pPr>
-      <w:r>
-        <w:t xml:space="preserve">Hecho: etapa 0 (base y variables), etapa 1 (tres piezas compartidas), etapa 2 (barra de navegación y pie de página) y etapa 3 (las páginas).</w:t>
-      </w:r>
-    </w:p>
-    <w:p>
-      <w:pPr>
-        <w:pStyle w:val="ListParagraph"/>
-        <w:numPr>
-          <w:ilvl w:val="0"/>
-          <w:numId w:val="2"/>
-        </w:numPr>
-        <w:spacing w:after="60"/>
-      </w:pPr>
-      <w:r>
-        <w:t xml:space="preserve">Pendiente, etapa 4: quitar Tailwind del proyecto (paquetes y plugin de Vite), eliminar el bloque de tema de </w:t>
-      </w:r>
-      <w:r>
-        <w:rPr>
-          <w:rFonts w:ascii="Consolas" w:cs="Consolas" w:eastAsia="Consolas" w:hAnsi="Consolas"/>
-          <w:color w:val="1F4E79"/>
-        </w:rPr>
-        <w:t xml:space="preserve">index.css</w:t>
-      </w:r>
-      <w:r>
-        <w:t xml:space="preserve">, comprobar que no queda ninguna clase con el prefijo </w:t>
+        <w:t xml:space="preserve">8. Etapa 4: quitar Tailwind</w:t>
+      </w:r>
+    </w:p>
+    <w:p>
+      <w:pPr>
+        <w:pStyle w:val="ListParagraph"/>
+        <w:numPr>
+          <w:ilvl w:val="0"/>
+          <w:numId w:val="2"/>
+        </w:numPr>
+        <w:spacing w:after="60"/>
+      </w:pPr>
+      <w:r>
+        <w:t xml:space="preserve">Se desinstalaron los dos paquetes de Tailwind (</w:t>
+      </w:r>
+      <w:r>
+        <w:rPr>
+          <w:rFonts w:ascii="Consolas" w:cs="Consolas" w:eastAsia="Consolas" w:hAnsi="Consolas"/>
+          <w:color w:val="1F4E79"/>
+        </w:rPr>
+        <w:t xml:space="preserve">tailwindcss</w:t>
+      </w:r>
+      <w:r>
+        <w:t xml:space="preserve"> y </w:t>
+      </w:r>
+      <w:r>
+        <w:rPr>
+          <w:rFonts w:ascii="Consolas" w:cs="Consolas" w:eastAsia="Consolas" w:hAnsi="Consolas"/>
+          <w:color w:val="1F4E79"/>
+        </w:rPr>
+        <w:t xml:space="preserve">@tailwindcss/vite</w:t>
+      </w:r>
+      <w:r>
+        <w:t xml:space="preserve">) con </w:t>
+      </w:r>
+      <w:r>
+        <w:rPr>
+          <w:rFonts w:ascii="Consolas" w:cs="Consolas" w:eastAsia="Consolas" w:hAnsi="Consolas"/>
+          <w:color w:val="1F4E79"/>
+        </w:rPr>
+        <w:t xml:space="preserve">npm uninstall</w:t>
+      </w:r>
+      <w:r>
+        <w:t xml:space="preserve">. Vite no se elimina: sigue siendo el programa que arranca y compila el sitio. En </w:t>
+      </w:r>
+      <w:r>
+        <w:rPr>
+          <w:rFonts w:ascii="Consolas" w:cs="Consolas" w:eastAsia="Consolas" w:hAnsi="Consolas"/>
+          <w:color w:val="1F4E79"/>
+        </w:rPr>
+        <w:t xml:space="preserve">vite.config.js</w:t>
+      </w:r>
+      <w:r>
+        <w:t xml:space="preserve"> se quitó la importación y el plugin de Tailwind y quedó solo el de React.</w:t>
+      </w:r>
+    </w:p>
+    <w:p>
+      <w:pPr>
+        <w:pStyle w:val="ListParagraph"/>
+        <w:numPr>
+          <w:ilvl w:val="0"/>
+          <w:numId w:val="2"/>
+        </w:numPr>
+        <w:spacing w:after="60"/>
+      </w:pPr>
+      <w:r>
+        <w:rPr>
+          <w:rFonts w:ascii="Consolas" w:cs="Consolas" w:eastAsia="Consolas" w:hAnsi="Consolas"/>
+          <w:color w:val="1F4E79"/>
+        </w:rPr>
+        <w:t xml:space="preserve">src/index.css</w:t>
+      </w:r>
+      <w:r>
+        <w:t xml:space="preserve"> quedó reducido a cuatro importaciones (variables, reset, estructura de página y botones); se eliminaron el orden de capas de Tailwind, sus dos importaciones y el bloque de tema, que ya solo duplicaba las variables propias. Los dos comentarios que mencionaban a Tailwind se reescribieron. El reset sigue dentro de una capa (</w:t>
+      </w:r>
+      <w:r>
+        <w:rPr>
+          <w:rFonts w:ascii="Consolas" w:cs="Consolas" w:eastAsia="Consolas" w:hAnsi="Consolas"/>
+          <w:color w:val="1F4E79"/>
+        </w:rPr>
+        <w:t xml:space="preserve">@layer base</w:t>
+      </w:r>
+      <w:r>
+        <w:t xml:space="preserve">) para que los estilos de cada componente siempre tengan prioridad sobre él.</w:t>
+      </w:r>
+    </w:p>
+    <w:p>
+      <w:pPr>
+        <w:pStyle w:val="ListParagraph"/>
+        <w:numPr>
+          <w:ilvl w:val="0"/>
+          <w:numId w:val="2"/>
+        </w:numPr>
+        <w:spacing w:after="60"/>
+      </w:pPr>
+      <w:r>
+        <w:t xml:space="preserve">Comprobación de que no queda nada: ninguna clase con el prefijo </w:t>
       </w:r>
       <w:r>
         <w:rPr>
@@ -1976,7 +2036,89 @@
         <w:t xml:space="preserve">tw:</w:t>
       </w:r>
       <w:r>
-        <w:t xml:space="preserve"> y eliminar la cuenta de prueba de la comparación.</w:t>
+        <w:t xml:space="preserve"> en el código, ninguna mención a Tailwind fuera de los comentarios sobre la migración, ninguna variable </w:t>
+      </w:r>
+      <w:r>
+        <w:rPr>
+          <w:rFonts w:ascii="Consolas" w:cs="Consolas" w:eastAsia="Consolas" w:hAnsi="Consolas"/>
+          <w:color w:val="1F4E79"/>
+        </w:rPr>
+        <w:t xml:space="preserve">--tw-</w:t>
+      </w:r>
+      <w:r>
+        <w:t xml:space="preserve"> en el CSS final y ninguna carpeta de Tailwind en </w:t>
+      </w:r>
+      <w:r>
+        <w:rPr>
+          <w:rFonts w:ascii="Consolas" w:cs="Consolas" w:eastAsia="Consolas" w:hAnsi="Consolas"/>
+          <w:color w:val="1F4E79"/>
+        </w:rPr>
+        <w:t xml:space="preserve">node_modules</w:t>
+      </w:r>
+      <w:r>
+        <w:t xml:space="preserve"> (npm dejó dos carpetas temporales de archivos nativos en Windows, que se borraron a mano).</w:t>
+      </w:r>
+    </w:p>
+    <w:p>
+      <w:pPr>
+        <w:pStyle w:val="ListParagraph"/>
+        <w:numPr>
+          <w:ilvl w:val="0"/>
+          <w:numId w:val="2"/>
+        </w:numPr>
+        <w:spacing w:after="60"/>
+      </w:pPr>
+      <w:r>
+        <w:t xml:space="preserve">Verificación final, ya sin Tailwind instalado, contra las mediciones de la versión original: 0 diferencias en las 40 combinaciones de páginas, 0 en los 8 casos de menús abiertos y hover de la barra y 0 en las 28 capturas de estados. El CSS final pesa 42 kB (7 kB comprimido).</w:t>
+      </w:r>
+    </w:p>
+    <w:p>
+      <w:pPr>
+        <w:pStyle w:val="ListParagraph"/>
+        <w:numPr>
+          <w:ilvl w:val="0"/>
+          <w:numId w:val="2"/>
+        </w:numPr>
+        <w:spacing w:after="60"/>
+      </w:pPr>
+      <w:r>
+        <w:t xml:space="preserve">Limpieza: se eliminó la cuenta de prueba </w:t>
+      </w:r>
+      <w:r>
+        <w:rPr>
+          <w:rFonts w:ascii="Consolas" w:cs="Consolas" w:eastAsia="Consolas" w:hAnsi="Consolas"/>
+          <w:color w:val="1F4E79"/>
+        </w:rPr>
+        <w:t xml:space="preserve">test-visual@beaken.demo</w:t>
+      </w:r>
+      <w:r>
+        <w:t xml:space="preserve"> (y con ella sus dos inscripciones, por el borrado en cascada) y se confirmó que no quedan otras cuentas de prueba; la base quedó con 47 usuarios y 15 actividades. Las herramientas de comparación están fuera del proyecto, en una carpeta temporal.</w:t>
+      </w:r>
+    </w:p>
+    <w:p>
+      <w:pPr>
+        <w:pStyle w:val="Heading2"/>
+        <w:spacing w:after="120" w:before="280"/>
+      </w:pPr>
+      <w:r>
+        <w:rPr>
+          <w:b/>
+          <w:bCs/>
+        </w:rPr>
+        <w:t xml:space="preserve">9. Estado: migración terminada</w:t>
+      </w:r>
+    </w:p>
+    <w:p>
+      <w:pPr>
+        <w:pStyle w:val="ListParagraph"/>
+        <w:numPr>
+          <w:ilvl w:val="0"/>
+          <w:numId w:val="2"/>
+        </w:numPr>
+        <w:spacing w:after="60"/>
+      </w:pPr>
+      <w:r>
+        <w:t xml:space="preserve">Hecho: etapa 0 (base y variables), etapa 1 (tres piezas compartidas), etapa 2 (barra de navegación y pie de página) etapa 3 (las páginas) y etapa 4 (quitar Tailwind). La migración está terminada: el sitio usa CSS propio con nombres BEM y no depende de Tailwind.</w:t>
       </w:r>
     </w:p>
     <w:sectPr>

</xml_diff>